<commit_message>
Regenerate .docx files from the corrected, de-linked Markdown drafts
The 7 original .docx files (as submitted) are now superseded by these
regenerated versions, built from projekty/md/*.md after all audit
fixes and the removal of repo-relative links. Converted with a
purpose-built md_to_docx.py (python-docx): headings, bold/italic runs,
and the one Markdown table in the Kodeks all verified by dumping the
regenerated documents back out and checking paragraph/run structure
and Polish diacritics. Git history still holds the original
as-submitted .docx via prior commits if needed.

Co-Authored-By: Claude Sonnet 5 <noreply@anthropic.com>
</commit_message>
<xml_diff>
--- a/projekty/01_Kodeks_odpowiedzialnego_sprawowania_mandatu.docx
+++ b/projekty/01_Kodeks_odpowiedzialnego_sprawowania_mandatu.docx
@@ -4,13 +4,10 @@
   <w:body>
     <w:p>
       <w:pPr>
+        <w:pStyle w:val="Title"/>
         <w:jc w:val="center"/>
       </w:pPr>
       <w:r>
-        <w:rPr>
-          <w:b/>
-          <w:sz w:val="42"/>
-        </w:rPr>
         <w:t>Kodeks odpowiedzialnego sprawowania mandatu</w:t>
       </w:r>
     </w:p>
@@ -21,15 +18,11 @@
       <w:r>
         <w:rPr>
           <w:i/>
-          <w:sz w:val="20"/>
         </w:rPr>
         <w:t>Spółdzielnia Mieszkaniowa „Doły-Marysińska” w Łodzi</w:t>
       </w:r>
     </w:p>
     <w:p>
-      <w:pPr>
-        <w:jc w:val="center"/>
-      </w:pPr>
       <w:r>
         <w:rPr>
           <w:b/>
@@ -37,7 +30,6 @@
         <w:t>PROJEKT ROBOCZY — do dyskusji i weryfikacji prawnej</w:t>
       </w:r>
     </w:p>
-    <w:p/>
     <w:p>
       <w:r>
         <w:rPr>
@@ -47,6 +39,33 @@
       </w:r>
       <w:r>
         <w:t>Projekt powstał przez przebudowę pierwotnego Kodeksu Etyki Organów Spółdzielni. Przed przyjęciem wymaga weryfikacji przez radcę prawnego Spółdzielni oraz sprawdzenia zgodności ze Statutem i regulaminami organów.</w:t>
+      </w:r>
+    </w:p>
+    <w:p>
+      <w:r>
+        <w:rPr>
+          <w:b/>
+        </w:rPr>
+        <w:t>Wersja 2 (po audycie)</w:t>
+      </w:r>
+      <w:r>
+        <w:t xml:space="preserve"> — poprawiono § 6 (uogólniono zapis o ekspertyzie specjalistycznej, tak by dotyczył każdej dziedziny wiedzy fachowej w Radzie, nie tylko IT) oraz § 15 (dodano konkretną propozycję trybu przyjęcia).</w:t>
+      </w:r>
+    </w:p>
+    <w:p>
+      <w:r>
+        <w:rPr>
+          <w:b/>
+        </w:rPr>
+        <w:t>Wersja 3 (świeży przegląd)</w:t>
+      </w:r>
+      <w:r>
+        <w:t xml:space="preserve"> — doprecyzowano § 4 ust. 3 (zdanie odrębne — brak tej podstawy w Regulaminie Rady Nadzorczej) i ust. 4 (niejasne pojęcie „sabotowania" zastąpione konkretnymi przykładami); § 13 uzupełniono o wskazanie realnych, już istniejących środków (odwołanie z funkcji), zamiast pozostawiać temat całkowicie abstrakcyjnym; § 15 dodano zasadę braku działania wstecz; § 8 dodano odesłanie do polityki RODO.</w:t>
+      </w:r>
+    </w:p>
+    <w:p>
+      <w:r>
+        <w:t>Pełny audyt — patrz odrębny dokument „Audyt pakietu dokumentów etycznych (projekty robocze)".</w:t>
       </w:r>
     </w:p>
     <w:p>
@@ -99,65 +118,41 @@
       </w:r>
     </w:p>
     <w:p>
-      <w:pPr>
-        <w:pStyle w:val="ListBullet"/>
-      </w:pPr>
       <w:r>
         <w:t>Lojalność wobec Spółdzielni — działanie w interesie całej Spółdzielni, a nie dla prywatnej korzyści, grupy, frakcji lub kontrahenta.</w:t>
       </w:r>
     </w:p>
     <w:p>
-      <w:pPr>
-        <w:pStyle w:val="ListBullet"/>
-      </w:pPr>
       <w:r>
         <w:t>Niezależność — podejmowanie decyzji bez niedopuszczalnego wpływu osób trzecich.</w:t>
       </w:r>
     </w:p>
     <w:p>
-      <w:pPr>
-        <w:pStyle w:val="ListBullet"/>
-      </w:pPr>
       <w:r>
         <w:t>Bezstronność — ujawnianie i właściwe rozwiązywanie konfliktów interesów.</w:t>
       </w:r>
     </w:p>
     <w:p>
-      <w:pPr>
-        <w:pStyle w:val="ListBullet"/>
-      </w:pPr>
       <w:r>
         <w:t>Rzetelność — opieranie twierdzeń i decyzji na sprawdzonych informacjach.</w:t>
       </w:r>
     </w:p>
     <w:p>
-      <w:pPr>
-        <w:pStyle w:val="ListBullet"/>
-      </w:pPr>
       <w:r>
         <w:t>Przejrzystość — dokumentowanie istotnych decyzji i podstaw ich podjęcia.</w:t>
       </w:r>
     </w:p>
     <w:p>
-      <w:pPr>
-        <w:pStyle w:val="ListBullet"/>
-      </w:pPr>
       <w:r>
         <w:t>Szacunek — krytyka dotyczy spraw, działań i dowodów, a nie godności osób.</w:t>
       </w:r>
     </w:p>
     <w:p>
-      <w:pPr>
-        <w:pStyle w:val="ListBullet"/>
-      </w:pPr>
       <w:r>
         <w:t>Odpowiedzialność — świadomość skutków prawnych, finansowych, technicznych i społecznych podejmowanych działań.</w:t>
       </w:r>
     </w:p>
     <w:p>
-      <w:pPr>
-        <w:pStyle w:val="ListBullet"/>
-      </w:pPr>
       <w:r>
         <w:t>Proporcjonalność — zakres procedury i kontroli powinien odpowiadać wadze i ryzyku sprawy.</w:t>
       </w:r>
@@ -210,12 +205,45 @@
     </w:p>
     <w:p>
       <w:r>
-        <w:t>3. Członek, który głosował przeciw uchwale, może zgłosić zdanie odrębne na zasadach określonych w regulaminie organu.</w:t>
+        <w:t xml:space="preserve">3. Członek, który głosował przeciw uchwale, może zgłosić zdanie odrębne na zasadach określonych w regulaminie organu. </w:t>
+      </w:r>
+      <w:r>
+        <w:rPr>
+          <w:b/>
+        </w:rPr>
+        <w:t>Uwaga po audycie</w:t>
+      </w:r>
+      <w:r>
+        <w:t xml:space="preserve">: dla Zarządu taka podstawa istnieje wprost (protokół zawiera „ew. zdanie odrębne" — Regulamin Zarządu, § 13), ale </w:t>
+      </w:r>
+      <w:r>
+        <w:rPr>
+          <w:b/>
+        </w:rPr>
+        <w:t>Regulamin Rady Nadzorczej nie zawiera dziś przepisu o zdaniu odrębnym</w:t>
+      </w:r>
+      <w:r>
+        <w:t xml:space="preserve"> (sprawdzone — brak tego pojęcia w całym dokumencie). Ten ustęp Kodeksu zakłada więc mechanizm, który dla Rady faktycznie nie istnieje. Przed przyjęciem Kodeksu należy albo uzupełnić Regulamin Rady Nadzorczej o tę instytucję, albo usunąć/przeformułować ten ustęp tak, by nie sugerował uprawnienia, którego nie ma.</w:t>
       </w:r>
     </w:p>
     <w:p>
       <w:r>
-        <w:t>4. Po prawidłowym podjęciu decyzji członek nie powinien podejmować działań mających na celu jej sabotowanie, zachowując prawo do korzystania ze środków przewidzianych prawem i Statutem.</w:t>
+        <w:t xml:space="preserve">4. Po prawidłowym podjęciu decyzji członek nie podejmuje działań </w:t>
+      </w:r>
+      <w:r>
+        <w:rPr>
+          <w:b/>
+        </w:rPr>
+        <w:t>sprzecznych z jej wykonaniem</w:t>
+      </w:r>
+      <w:r>
+        <w:t xml:space="preserve"> — w szczególności nie instruuje pracowników ani kontrahentów, by uchwały nie wykonywali, nie przedstawia publicznie uchwały jako nieobowiązującej, oraz nie utrudnia jej realizacji poza trybem przewidzianym prawem i Statutem — zachowując przy tym prawo do korzystania ze środków przewidzianych prawem i Statutem (odwołanie, zaskarżenie uchwały do sądu, zdanie odrębne). </w:t>
+      </w:r>
+      <w:r>
+        <w:rPr>
+          <w:i/>
+        </w:rPr>
+        <w:t>(Doprecyzowane po audycie — pierwotne „sabotowanie" nie miało definicji, co czyniło ten przepis trudnym do stosowania i podatnym na nadużycie jako niejasny zarzut wobec osoby głosującej mniejszościowo.)</w:t>
       </w:r>
     </w:p>
     <w:p>
@@ -251,22 +279,27 @@
     </w:p>
     <w:p>
       <w:r>
-        <w:t>1. Wiedza zawodowa członków Rady jest zasobem wspierającym nadzór.</w:t>
+        <w:t>1. Wiedza zawodowa i fachowa członków Rady — niezależnie od dziedziny (np. budownictwo, finanse, prawo, IT, zarządzanie nieruchomościami) — jest zasobem wspierającym nadzór, a nie podstawą do przejęcia wykonawstwa w tej dziedzinie.</w:t>
       </w:r>
     </w:p>
     <w:p>
       <w:r>
-        <w:t>2. Członek posiadający wiedzę specjalistyczną może analizować materiały, wskazywać ryzyka, proponować kryteria oceny, rekomendować niezależny audyt i uczestniczyć w ocenie rezultatów.</w:t>
+        <w:t>2. Członek posiadający wiedzę specjalistyczną w danej dziedzinie może w jej zakresie: analizować materiały, wskazywać ryzyka, proponować kryteria oceny, rekomendować niezależny audyt lub ekspertyzę zewnętrzną oraz uczestniczyć w ocenie rezultatów podjętych działań.</w:t>
       </w:r>
     </w:p>
     <w:p>
       <w:r>
-        <w:t>3. Ekspert w Radzie nie przejmuje roli wykonawczej. W szczególności nie administruje systemami produkcyjnymi, nie wydaje poleceń pracownikom, nie negocjuje w imieniu Spółdzielni i nie kieruje projektem.</w:t>
+        <w:t>3. Ta sama zasada obowiązuje niezależnie od dziedziny eksperckiej: członek Rady nie przejmuje roli wykonawczej właściwej Zarządowi lub pracownikom Spółdzielni. W szczególności — bez względu na to, czy chodzi o systemy informatyczne, dokumentację techniczną budynków, księgowość czy inną materię operacyjną — nie administruje systemami/procesami produkcyjnymi, nie wydaje poleceń pracownikom, nie negocjuje w imieniu Spółdzielni i nie kieruje samodzielnie realizacją projektu.</w:t>
       </w:r>
     </w:p>
     <w:p>
       <w:r>
-        <w:t>4. Dostęp do informacji potrzebnych do kontroli powinien być realizowany w sposób proporcjonalny i bezpieczny; zakaz dostępu operacyjnego nie oznacza zakazu dostępu do informacji niezbędnych do wykonywania funkcji nadzorczej.</w:t>
+        <w:t>4. Dostęp do informacji potrzebnych do kontroli w danej dziedzinie powinien być realizowany w sposób proporcjonalny i bezpieczny; zakaz dostępu operacyjnego nie oznacza zakazu dostępu do informacji niezbędnych do wykonywania funkcji nadzorczej.</w:t>
+      </w:r>
+    </w:p>
+    <w:p>
+      <w:r>
+        <w:t>5. Powyższe zasady stosuje się jednolicie do wszystkich członków Rady dysponujących wiedzą specjalistyczną w jakiejkolwiek dziedzinie — nie tylko do spraw związanych z technologią czy IT.</w:t>
       </w:r>
     </w:p>
     <w:p>
@@ -322,7 +355,7 @@
     </w:p>
     <w:p>
       <w:r>
-        <w:t>5. Szczegółowe zasady publikacji informacji określają Statut, przepisy prawa i właściwe standardy komunikacji.</w:t>
+        <w:t>5. Szczegółowe zasady publikacji informacji określają Statut, przepisy prawa i właściwe standardy komunikacji. Zasady przetwarzania danych osobowych mieszkańców/członków, do których członkowie organów mają dostęp — patrz wewnętrzna polityka ochrony danych osobowych Spółdzielni (RODO).</w:t>
       </w:r>
     </w:p>
     <w:p>
@@ -432,6 +465,61 @@
     </w:p>
     <w:p>
       <w:r>
+        <w:t xml:space="preserve">1a. </w:t>
+      </w:r>
+      <w:r>
+        <w:rPr>
+          <w:b/>
+        </w:rPr>
+        <w:t>Istniejące, statutowe środki</w:t>
+      </w:r>
+      <w:r>
+        <w:t xml:space="preserve"> (dla jasności, nie jako nowe uprawnienie — patrz § 1 ust. 2): naruszenie Kodeksu przez członka Zarządu może stanowić podstawę </w:t>
+      </w:r>
+      <w:r>
+        <w:rPr>
+          <w:b/>
+        </w:rPr>
+        <w:t>odwołania go z Zarządu przez Radę Nadzorczą</w:t>
+      </w:r>
+      <w:r>
+        <w:t xml:space="preserve">, z pisemnym uzasadnieniem (Statut § 55 ust. 2); naruszenie przez członka Rady Nadzorczej może stanowić podstawę </w:t>
+      </w:r>
+      <w:r>
+        <w:rPr>
+          <w:b/>
+        </w:rPr>
+        <w:t>odwołania go z Rady przez Walne Zgromadzenie</w:t>
+      </w:r>
+      <w:r>
+        <w:t xml:space="preserve"> większością 2/3 głosów (Statut § 48). </w:t>
+      </w:r>
+      <w:r>
+        <w:rPr>
+          <w:b/>
+        </w:rPr>
+        <w:t>Kodeks nie przewiduje dziś żadnej sankcji pośredniej</w:t>
+      </w:r>
+      <w:r>
+        <w:t xml:space="preserve"> (upomnienie, nagana) — jedynym dostępnym środkiem pozostaje pełne odwołanie z organu, co jest krokiem poważnym i niewspółmiernym do drobniejszych naruszeń. Warto rozważyć w toku dalszych prac, czy pakiet dokumentów powinien przewidywać także łagodniejsze reakcje (np. formalne zwrócenie uwagi przez Prezydium/Przewodniczącego), czy pozostać przy zasadzie „albo nic, albo odwołanie".</w:t>
+      </w:r>
+    </w:p>
+    <w:p>
+      <w:r>
+        <w:t xml:space="preserve">1b. </w:t>
+      </w:r>
+      <w:r>
+        <w:rPr>
+          <w:b/>
+        </w:rPr>
+        <w:t>Ogólne „wykluczenie ze Spółdzielni" (utrata członkostwa) nie jest tu adekwatnym środkiem</w:t>
+      </w:r>
+      <w:r>
+        <w:t xml:space="preserve"> i nie powinno być z tym mylone — niezależnie od wątpliwości co do jego dzisiejszej podstawy prawnej w ogóle (patrz zastrzeżenie prawne w wewnętrznej dokumentacji procedury windykacyjnej Spółdzielni dot. wykluczenia), naruszenie Kodeksu przez sprawowanie mandatu nie jest tym samym co niewykonywanie obowiązków członkowskich, więc nawet gdyby ta podstawa istniała, nie byłaby tu naturalnym środkiem — właściwym jest odwołanie z funkcji (ust. 1a), nie utrata członkostwa.</w:t>
+      </w:r>
+    </w:p>
+    <w:p>
+      <w:r>
         <w:t>2. Postępowanie dotyczące naruszenia powinno zapewniać bezstronność, możliwość przedstawienia wyjaśnień oraz wyłączenie osoby, której dotyczy sprawa.</w:t>
       </w:r>
     </w:p>
@@ -473,17 +561,60 @@
     </w:p>
     <w:p>
       <w:r>
-        <w:t>1. Sposób przyjęcia Kodeksu oraz jego relację do regulaminów organów należy ustalić po weryfikacji prawnej.</w:t>
+        <w:t xml:space="preserve">1. </w:t>
+      </w:r>
+      <w:r>
+        <w:rPr>
+          <w:b/>
+        </w:rPr>
+        <w:t>Propozycja trybu przyjęcia</w:t>
+      </w:r>
+      <w:r>
+        <w:t xml:space="preserve"> (do potwierdzenia przez radcę prawnego): Kodeks reguluje zachowanie zarówno członków Rady Nadzorczej, jak i Zarządu. Ponieważ uchwalanie regulaminu Rady Nadzorczej jest zastrzeżone dla Walnego Zgromadzenia (§ 36 pkt 16 Statutu), a Kodeks w części dotyczącej Rady ma charakter zbliżony do materii regulaminowej (np. § 3, § 10), rekomenduje się, aby </w:t>
+      </w:r>
+      <w:r>
+        <w:rPr>
+          <w:b/>
+        </w:rPr>
+        <w:t>Kodeks przyjęło Walne Zgromadzenie</w:t>
+      </w:r>
+      <w:r>
+        <w:t xml:space="preserve"> — tak jak przyjmuje Regulamin Rady Nadzorczej — niezależnie od tego, że sam Kodeks nie tworzy nowych kompetencji (§ 1 ust. 2). Alternatywnie, jeżeli radca prawny uzna to za wystarczające, możliwe jest przyjęcie odrębnie: przez Radę Nadzorczą — części dotyczącej wyłącznie jej własnego postępowania (na zasadzie samoograniczenia analogicznego do regulaminów wewnętrznych), oraz przez Radę Nadzorczą jako część Regulaminu Zarządu — w części dotyczącej Zarządu (Statut § 49 ust. 1 pkt 20). Rozwiązanie „WZ przyjmuje całość" jest prostsze i mniej podatne na zarzut obejścia kompetencji WZ.</w:t>
       </w:r>
     </w:p>
     <w:p>
       <w:r>
-        <w:t>2. Członkowie organów potwierdzają zapoznanie się z Kodeksem.</w:t>
+        <w:t>2. Jeżeli obowiązywał wcześniej odrębny „Kodeks Etyki Organów Spółdzielni", należy ustalić, jakim trybem został przyjęty, i uchylić go tym samym trybem równolegle z przyjęciem niniejszego Kodeksu — inaczej może dojść do jednoczesnego obowiązywania dwóch dokumentów.</w:t>
       </w:r>
     </w:p>
     <w:p>
       <w:r>
-        <w:t>3. Data wejścia w życie: [●].</w:t>
+        <w:t>3. Członkowie organów potwierdzają zapoznanie się z Kodeksem.</w:t>
+      </w:r>
+    </w:p>
+    <w:p>
+      <w:r>
+        <w:t xml:space="preserve">4. </w:t>
+      </w:r>
+      <w:r>
+        <w:rPr>
+          <w:b/>
+        </w:rPr>
+        <w:t>Brak działania wstecz</w:t>
+      </w:r>
+      <w:r>
+        <w:t xml:space="preserve">: Kodeks ocenia zachowania od dnia jego wejścia w życie. Nie służy do wstecznej kwalifikacji zachowań sprzed tej daty jako „naruszenia Kodeksu" — co nie ogranicza oceny takich zachowań na podstawie przepisów i regulaminów już wcześniej obowiązujących. </w:t>
+      </w:r>
+      <w:r>
+        <w:rPr>
+          <w:i/>
+        </w:rPr>
+        <w:t>(Dodane po audycie — dokument w kilku miejscach wyraźnie nawiązuje do doświadczeń niedawnego okresu; jasna reguła nieretroakcji zapobiega odbiorowi Kodeksu jako narzędzia do rozliczania przeszłości, a nie ustanawiania standardu na przyszłość.)</w:t>
+      </w:r>
+    </w:p>
+    <w:p>
+      <w:r>
+        <w:t>5. Data wejścia w życie: [●].</w:t>
       </w:r>
     </w:p>
     <w:p>
@@ -501,28 +632,32 @@
         <w:tblLook w:firstColumn="1" w:firstRow="1" w:lastColumn="0" w:lastRow="0" w:noHBand="0" w:noVBand="1" w:val="04A0"/>
       </w:tblPr>
       <w:tblGrid>
-        <w:gridCol w:w="4872"/>
-        <w:gridCol w:w="4872"/>
+        <w:gridCol w:w="4320"/>
+        <w:gridCol w:w="4320"/>
       </w:tblGrid>
       <w:tr>
         <w:tc>
           <w:tcPr>
-            <w:tcW w:type="dxa" w:w="4872"/>
-            <w:shd w:fill="D9E2F3"/>
+            <w:tcW w:type="dxa" w:w="4320"/>
           </w:tcPr>
           <w:p>
             <w:r>
+              <w:rPr>
+                <w:b/>
+              </w:rPr>
               <w:t>Dobre działanie</w:t>
             </w:r>
           </w:p>
         </w:tc>
         <w:tc>
           <w:tcPr>
-            <w:tcW w:type="dxa" w:w="4872"/>
-            <w:shd w:fill="D9E2F3"/>
+            <w:tcW w:type="dxa" w:w="4320"/>
           </w:tcPr>
           <w:p>
             <w:r>
+              <w:rPr>
+                <w:b/>
+              </w:rPr>
               <w:t>Działanie niewłaściwe</w:t>
             </w:r>
           </w:p>
@@ -531,7 +666,7 @@
       <w:tr>
         <w:tc>
           <w:tcPr>
-            <w:tcW w:type="dxa" w:w="4872"/>
+            <w:tcW w:type="dxa" w:w="4320"/>
           </w:tcPr>
           <w:p>
             <w:r>
@@ -541,7 +676,7 @@
         </w:tc>
         <w:tc>
           <w:tcPr>
-            <w:tcW w:type="dxa" w:w="4872"/>
+            <w:tcW w:type="dxa" w:w="4320"/>
           </w:tcPr>
           <w:p>
             <w:r>
@@ -553,7 +688,7 @@
       <w:tr>
         <w:tc>
           <w:tcPr>
-            <w:tcW w:type="dxa" w:w="4872"/>
+            <w:tcW w:type="dxa" w:w="4320"/>
           </w:tcPr>
           <w:p>
             <w:r>
@@ -563,7 +698,7 @@
         </w:tc>
         <w:tc>
           <w:tcPr>
-            <w:tcW w:type="dxa" w:w="4872"/>
+            <w:tcW w:type="dxa" w:w="4320"/>
           </w:tcPr>
           <w:p>
             <w:r>
@@ -575,7 +710,7 @@
       <w:tr>
         <w:tc>
           <w:tcPr>
-            <w:tcW w:type="dxa" w:w="4872"/>
+            <w:tcW w:type="dxa" w:w="4320"/>
           </w:tcPr>
           <w:p>
             <w:r>
@@ -585,7 +720,7 @@
         </w:tc>
         <w:tc>
           <w:tcPr>
-            <w:tcW w:type="dxa" w:w="4872"/>
+            <w:tcW w:type="dxa" w:w="4320"/>
           </w:tcPr>
           <w:p>
             <w:r>
@@ -597,7 +732,7 @@
       <w:tr>
         <w:tc>
           <w:tcPr>
-            <w:tcW w:type="dxa" w:w="4872"/>
+            <w:tcW w:type="dxa" w:w="4320"/>
           </w:tcPr>
           <w:p>
             <w:r>
@@ -607,7 +742,7 @@
         </w:tc>
         <w:tc>
           <w:tcPr>
-            <w:tcW w:type="dxa" w:w="4872"/>
+            <w:tcW w:type="dxa" w:w="4320"/>
           </w:tcPr>
           <w:p>
             <w:r>
@@ -619,7 +754,7 @@
       <w:tr>
         <w:tc>
           <w:tcPr>
-            <w:tcW w:type="dxa" w:w="4872"/>
+            <w:tcW w:type="dxa" w:w="4320"/>
           </w:tcPr>
           <w:p>
             <w:r>
@@ -629,7 +764,7 @@
         </w:tc>
         <w:tc>
           <w:tcPr>
-            <w:tcW w:type="dxa" w:w="4872"/>
+            <w:tcW w:type="dxa" w:w="4320"/>
           </w:tcPr>
           <w:p>
             <w:r>
@@ -641,7 +776,7 @@
       <w:tr>
         <w:tc>
           <w:tcPr>
-            <w:tcW w:type="dxa" w:w="4872"/>
+            <w:tcW w:type="dxa" w:w="4320"/>
           </w:tcPr>
           <w:p>
             <w:r>
@@ -651,7 +786,7 @@
         </w:tc>
         <w:tc>
           <w:tcPr>
-            <w:tcW w:type="dxa" w:w="4872"/>
+            <w:tcW w:type="dxa" w:w="4320"/>
           </w:tcPr>
           <w:p>
             <w:r>
@@ -663,7 +798,7 @@
     </w:tbl>
     <w:sectPr>
       <w:pgSz w:w="12240" w:h="15840"/>
-      <w:pgMar w:top="1247" w:right="1134" w:bottom="1134" w:left="1361" w:header="720" w:footer="720" w:gutter="0"/>
+      <w:pgMar w:top="1440" w:right="1800" w:bottom="1440" w:left="1800" w:header="720" w:footer="720" w:gutter="0"/>
       <w:cols w:space="720"/>
       <w:docGrid w:linePitch="360"/>
     </w:sectPr>
@@ -1035,8 +1170,8 @@
     <w:qFormat/>
     <w:rsid w:val="00FC693F"/>
     <w:rPr>
-      <w:rFonts w:ascii="Aptos" w:hAnsi="Aptos"/>
-      <w:sz w:val="21"/>
+      <w:rFonts w:ascii="Calibri" w:hAnsi="Calibri"/>
+      <w:sz w:val="22"/>
     </w:rPr>
   </w:style>
   <w:style w:type="paragraph" w:styleId="Header">
@@ -1098,11 +1233,11 @@
       <w:outlineLvl w:val="0"/>
     </w:pPr>
     <w:rPr>
-      <w:rFonts w:asciiTheme="majorHAnsi" w:eastAsiaTheme="majorEastAsia" w:hAnsiTheme="majorHAnsi" w:cstheme="majorBidi" w:ascii="Aptos Display" w:hAnsi="Aptos Display"/>
+      <w:rFonts w:asciiTheme="majorHAnsi" w:eastAsiaTheme="majorEastAsia" w:hAnsiTheme="majorHAnsi" w:cstheme="majorBidi"/>
       <w:b/>
       <w:bCs/>
       <w:color w:val="365F91" w:themeColor="accent1" w:themeShade="BF"/>
-      <w:sz w:val="30"/>
+      <w:sz w:val="28"/>
       <w:szCs w:val="28"/>
     </w:rPr>
   </w:style>
@@ -1122,11 +1257,11 @@
       <w:outlineLvl w:val="1"/>
     </w:pPr>
     <w:rPr>
-      <w:rFonts w:asciiTheme="majorHAnsi" w:eastAsiaTheme="majorEastAsia" w:hAnsiTheme="majorHAnsi" w:cstheme="majorBidi" w:ascii="Aptos Display" w:hAnsi="Aptos Display"/>
+      <w:rFonts w:asciiTheme="majorHAnsi" w:eastAsiaTheme="majorEastAsia" w:hAnsiTheme="majorHAnsi" w:cstheme="majorBidi"/>
       <w:b/>
       <w:bCs/>
       <w:color w:val="4F81BD" w:themeColor="accent1"/>
-      <w:sz w:val="24"/>
+      <w:sz w:val="26"/>
       <w:szCs w:val="26"/>
     </w:rPr>
   </w:style>
@@ -1146,7 +1281,7 @@
       <w:outlineLvl w:val="2"/>
     </w:pPr>
     <w:rPr>
-      <w:rFonts w:asciiTheme="majorHAnsi" w:eastAsiaTheme="majorEastAsia" w:hAnsiTheme="majorHAnsi" w:cstheme="majorBidi" w:ascii="Aptos Display" w:hAnsi="Aptos Display"/>
+      <w:rFonts w:asciiTheme="majorHAnsi" w:eastAsiaTheme="majorEastAsia" w:hAnsiTheme="majorHAnsi" w:cstheme="majorBidi"/>
       <w:b/>
       <w:bCs/>
       <w:color w:val="4F81BD" w:themeColor="accent1"/>
@@ -1387,11 +1522,11 @@
       <w:contextualSpacing/>
     </w:pPr>
     <w:rPr>
-      <w:rFonts w:asciiTheme="majorHAnsi" w:eastAsiaTheme="majorEastAsia" w:hAnsiTheme="majorHAnsi" w:cstheme="majorBidi" w:ascii="Aptos Display" w:hAnsi="Aptos Display"/>
+      <w:rFonts w:asciiTheme="majorHAnsi" w:eastAsiaTheme="majorEastAsia" w:hAnsiTheme="majorHAnsi" w:cstheme="majorBidi"/>
       <w:color w:val="17365D" w:themeColor="text2" w:themeShade="BF"/>
       <w:spacing w:val="5"/>
       <w:kern w:val="28"/>
-      <w:sz w:val="44"/>
+      <w:sz w:val="52"/>
       <w:szCs w:val="52"/>
     </w:rPr>
   </w:style>

</xml_diff>

<commit_message>
Trim Kodeks §13/§15 to bare facts, expand załącznik example, drop dead §15 clause
- §13: cut the reasoning/hedging around enforcement (why it's a severe
  step, whether to add lighter sanctions, the wykluczenie tangent) down
  to the two bare facts - RN can recall a Zarząd member, WZ can recall
  an RN member.
- §15: removed ust. 2 (uchylenie starego "Kodeksu Etyki Organów
  Spółdzielni") - never existed/was never in force, so the clause is
  moot; renumbered the following items.
- §15 (now ust. 3): dropped the trailing "nie ogranicza oceny... już
  wcześniej obowiązujących" clause from the non-retroactivity rule.
- Załącznik: expanded the vague "Samodzielnie prowadzę projekt" example
  into something concrete (administruje systemem, negocjuje z
  wykonawcą, wydaje polecenia).

Updated projekty/README.md's open-questions table to match the new
paragraph numbers and the removed §15 item. Regenerated the .docx.

Co-Authored-By: Claude Sonnet 5 <noreply@anthropic.com>
</commit_message>
<xml_diff>
--- a/projekty/01_Kodeks_odpowiedzialnego_sprawowania_mandatu.docx
+++ b/projekty/01_Kodeks_odpowiedzialnego_sprawowania_mandatu.docx
@@ -414,57 +414,7 @@
     </w:p>
     <w:p>
       <w:r>
-        <w:t xml:space="preserve">1a. </w:t>
-      </w:r>
-      <w:r>
-        <w:rPr>
-          <w:b/>
-        </w:rPr>
-        <w:t>Istniejące, statutowe środki</w:t>
-      </w:r>
-      <w:r>
-        <w:t xml:space="preserve"> (dla jasności, nie jako nowe uprawnienie — patrz § 1 ust. 2): naruszenie Kodeksu przez członka Zarządu może stanowić podstawę </w:t>
-      </w:r>
-      <w:r>
-        <w:rPr>
-          <w:b/>
-        </w:rPr>
-        <w:t>odwołania go z Zarządu przez Radę Nadzorczą</w:t>
-      </w:r>
-      <w:r>
-        <w:t xml:space="preserve">, z pisemnym uzasadnieniem (Statut § 55 ust. 2); naruszenie przez członka Rady Nadzorczej może stanowić podstawę </w:t>
-      </w:r>
-      <w:r>
-        <w:rPr>
-          <w:b/>
-        </w:rPr>
-        <w:t>odwołania go z Rady przez Walne Zgromadzenie</w:t>
-      </w:r>
-      <w:r>
-        <w:t xml:space="preserve"> większością 2/3 głosów (Statut § 48). </w:t>
-      </w:r>
-      <w:r>
-        <w:rPr>
-          <w:b/>
-        </w:rPr>
-        <w:t>Kodeks nie przewiduje dziś żadnej sankcji pośredniej</w:t>
-      </w:r>
-      <w:r>
-        <w:t xml:space="preserve"> (upomnienie, nagana) — jedynym dostępnym środkiem pozostaje pełne odwołanie z organu, co jest krokiem poważnym i niewspółmiernym do drobniejszych naruszeń. Warto rozważyć w toku dalszych prac, czy pakiet dokumentów powinien przewidywać także łagodniejsze reakcje (np. formalne zwrócenie uwagi przez Prezydium/Przewodniczącego), czy pozostać przy zasadzie „albo nic, albo odwołanie".</w:t>
-      </w:r>
-    </w:p>
-    <w:p>
-      <w:r>
-        <w:t xml:space="preserve">1b. </w:t>
-      </w:r>
-      <w:r>
-        <w:rPr>
-          <w:b/>
-        </w:rPr>
-        <w:t>Ogólne „wykluczenie ze Spółdzielni" (utrata członkostwa) nie jest tu adekwatnym środkiem</w:t>
-      </w:r>
-      <w:r>
-        <w:t xml:space="preserve"> i nie powinno być z tym mylone — niezależnie od wątpliwości co do jego dzisiejszej podstawy prawnej w ogóle (patrz zastrzeżenie prawne w wewnętrznej dokumentacji procedury windykacyjnej Spółdzielni dot. wykluczenia), naruszenie Kodeksu przez sprawowanie mandatu nie jest tym samym co niewykonywanie obowiązków członkowskich, więc nawet gdyby ta podstawa istniała, nie byłaby tu naturalnym środkiem — właściwym jest odwołanie z funkcji (ust. 1a), nie utrata członkostwa.</w:t>
+        <w:t>1a. Naruszenie Kodeksu przez członka Zarządu może stanowić podstawę odwołania go z Zarządu przez Radę Nadzorczą, z pisemnym uzasadnieniem (Statut § 55 ust. 2). Naruszenie przez członka Rady Nadzorczej może stanowić podstawę odwołania go z Rady przez Walne Zgromadzenie większością 2/3 głosów (Statut § 48).</w:t>
       </w:r>
     </w:p>
     <w:p>
@@ -533,17 +483,12 @@
     </w:p>
     <w:p>
       <w:r>
-        <w:t>2. Jeżeli obowiązywał wcześniej odrębny „Kodeks Etyki Organów Spółdzielni", należy ustalić, jakim trybem został przyjęty, i uchylić go tym samym trybem równolegle z przyjęciem niniejszego Kodeksu — inaczej może dojść do jednoczesnego obowiązywania dwóch dokumentów.</w:t>
+        <w:t>2. Członkowie organów potwierdzają zapoznanie się z Kodeksem.</w:t>
       </w:r>
     </w:p>
     <w:p>
       <w:r>
-        <w:t>3. Członkowie organów potwierdzają zapoznanie się z Kodeksem.</w:t>
-      </w:r>
-    </w:p>
-    <w:p>
-      <w:r>
-        <w:t xml:space="preserve">4. </w:t>
+        <w:t xml:space="preserve">3. </w:t>
       </w:r>
       <w:r>
         <w:rPr>
@@ -552,12 +497,12 @@
         <w:t>Brak działania wstecz</w:t>
       </w:r>
       <w:r>
-        <w:t>: Kodeks ocenia zachowania od dnia jego wejścia w życie. Nie służy do wstecznej kwalifikacji zachowań sprzed tej daty jako „naruszenia Kodeksu" — co nie ogranicza oceny takich zachowań na podstawie przepisów i regulaminów już wcześniej obowiązujących.</w:t>
+        <w:t>: Kodeks ocenia zachowania od dnia jego wejścia w życie. Nie służy do wstecznej kwalifikacji zachowań sprzed tej daty jako „naruszenia Kodeksu".</w:t>
       </w:r>
     </w:p>
     <w:p>
       <w:r>
-        <w:t>5. Data wejścia w życie: [●].</w:t>
+        <w:t>4. Data wejścia w życie: [●].</w:t>
       </w:r>
     </w:p>
     <w:p>
@@ -645,7 +590,7 @@
           </w:tcPr>
           <w:p>
             <w:r>
-              <w:t>Samodzielnie prowadzę projekt</w:t>
+              <w:t>Sam wykonuję prace projektu zamiast go nadzorować (np. administruję systemem, negocjuję z wykonawcą, wydaję mu polecenia)</w:t>
             </w:r>
           </w:p>
         </w:tc>

</xml_diff>